<commit_message>
formate correction , and difficulty level added
</commit_message>
<xml_diff>
--- a/Qgenie Docs.docx
+++ b/Qgenie Docs.docx
@@ -284,7 +284,6 @@
                                       <w:lang w:val="en-US"/>
                                     </w:rPr>
                                   </w:pPr>
-                                  <w:proofErr w:type="spellStart"/>
                                   <w:r>
                                     <w:rPr>
                                       <w:sz w:val="24"/>
@@ -301,7 +300,6 @@
                                     </w:rPr>
                                     <w:t>.jsx</w:t>
                                   </w:r>
-                                  <w:proofErr w:type="spellEnd"/>
                                 </w:p>
                               </w:tc>
                               <w:tc>
@@ -373,18 +371,8 @@
                                       <w:szCs w:val="24"/>
                                       <w:lang w:val="en-US"/>
                                     </w:rPr>
-                                    <w:t>/</w:t>
-                                  </w:r>
-                                  <w:proofErr w:type="spellStart"/>
-                                  <w:r>
-                                    <w:rPr>
-                                      <w:sz w:val="24"/>
-                                      <w:szCs w:val="24"/>
-                                      <w:lang w:val="en-US"/>
-                                    </w:rPr>
-                                    <w:t>editProfile</w:t>
-                                  </w:r>
-                                  <w:proofErr w:type="spellEnd"/>
+                                    <w:t>/editProfile</w:t>
+                                  </w:r>
                                 </w:p>
                               </w:tc>
                               <w:tc>
@@ -484,18 +472,8 @@
                                       <w:szCs w:val="24"/>
                                       <w:lang w:val="en-US"/>
                                     </w:rPr>
-                                    <w:t>/</w:t>
-                                  </w:r>
-                                  <w:proofErr w:type="spellStart"/>
-                                  <w:r>
-                                    <w:rPr>
-                                      <w:sz w:val="24"/>
-                                      <w:szCs w:val="24"/>
-                                      <w:lang w:val="en-US"/>
-                                    </w:rPr>
-                                    <w:t>confirmAccess</w:t>
-                                  </w:r>
-                                  <w:proofErr w:type="spellEnd"/>
+                                    <w:t>/confirmAccess</w:t>
+                                  </w:r>
                                 </w:p>
                               </w:tc>
                               <w:tc>
@@ -611,18 +589,8 @@
                                       <w:szCs w:val="24"/>
                                       <w:lang w:val="en-US"/>
                                     </w:rPr>
-                                    <w:t>/</w:t>
-                                  </w:r>
-                                  <w:proofErr w:type="spellStart"/>
-                                  <w:r>
-                                    <w:rPr>
-                                      <w:sz w:val="24"/>
-                                      <w:szCs w:val="24"/>
-                                      <w:lang w:val="en-US"/>
-                                    </w:rPr>
-                                    <w:t>resetPassword</w:t>
-                                  </w:r>
-                                  <w:proofErr w:type="spellEnd"/>
+                                    <w:t>/resetPassword</w:t>
+                                  </w:r>
                                 </w:p>
                               </w:tc>
                               <w:tc>
@@ -760,7 +728,6 @@
                                       <w:lang w:val="en-US"/>
                                     </w:rPr>
                                   </w:pPr>
-                                  <w:proofErr w:type="spellStart"/>
                                   <w:r>
                                     <w:rPr>
                                       <w:sz w:val="24"/>
@@ -777,7 +744,6 @@
                                     </w:rPr>
                                     <w:t>.jsx</w:t>
                                   </w:r>
-                                  <w:proofErr w:type="spellEnd"/>
                                 </w:p>
                               </w:tc>
                               <w:tc>
@@ -1013,7 +979,6 @@
                                       <w:lang w:val="en-US"/>
                                     </w:rPr>
                                   </w:pPr>
-                                  <w:proofErr w:type="spellStart"/>
                                   <w:r>
                                     <w:rPr>
                                       <w:sz w:val="24"/>
@@ -1030,7 +995,6 @@
                                     </w:rPr>
                                     <w:t>.jsx</w:t>
                                   </w:r>
-                                  <w:proofErr w:type="spellEnd"/>
                                 </w:p>
                               </w:tc>
                               <w:tc>
@@ -1102,18 +1066,8 @@
                                       <w:szCs w:val="24"/>
                                       <w:lang w:val="en-US"/>
                                     </w:rPr>
-                                    <w:t>/</w:t>
-                                  </w:r>
-                                  <w:proofErr w:type="spellStart"/>
-                                  <w:r>
-                                    <w:rPr>
-                                      <w:sz w:val="24"/>
-                                      <w:szCs w:val="24"/>
-                                      <w:lang w:val="en-US"/>
-                                    </w:rPr>
-                                    <w:t>editProfile</w:t>
-                                  </w:r>
-                                  <w:proofErr w:type="spellEnd"/>
+                                    <w:t>/editProfile</w:t>
+                                  </w:r>
                                 </w:p>
                               </w:tc>
                               <w:tc>
@@ -1213,18 +1167,8 @@
                                       <w:szCs w:val="24"/>
                                       <w:lang w:val="en-US"/>
                                     </w:rPr>
-                                    <w:t>/</w:t>
-                                  </w:r>
-                                  <w:proofErr w:type="spellStart"/>
-                                  <w:r>
-                                    <w:rPr>
-                                      <w:sz w:val="24"/>
-                                      <w:szCs w:val="24"/>
-                                      <w:lang w:val="en-US"/>
-                                    </w:rPr>
-                                    <w:t>confirmAccess</w:t>
-                                  </w:r>
-                                  <w:proofErr w:type="spellEnd"/>
+                                    <w:t>/confirmAccess</w:t>
+                                  </w:r>
                                 </w:p>
                               </w:tc>
                               <w:tc>
@@ -1348,18 +1292,8 @@
                                       <w:szCs w:val="24"/>
                                       <w:lang w:val="en-US"/>
                                     </w:rPr>
-                                    <w:t>/</w:t>
-                                  </w:r>
-                                  <w:proofErr w:type="spellStart"/>
-                                  <w:r>
-                                    <w:rPr>
-                                      <w:sz w:val="24"/>
-                                      <w:szCs w:val="24"/>
-                                      <w:lang w:val="en-US"/>
-                                    </w:rPr>
-                                    <w:t>resetPassword</w:t>
-                                  </w:r>
-                                  <w:proofErr w:type="spellEnd"/>
+                                    <w:t>/resetPassword</w:t>
+                                  </w:r>
                                 </w:p>
                               </w:tc>
                               <w:tc>
@@ -1497,7 +1431,6 @@
                                       <w:lang w:val="en-US"/>
                                     </w:rPr>
                                   </w:pPr>
-                                  <w:proofErr w:type="spellStart"/>
                                   <w:r>
                                     <w:rPr>
                                       <w:sz w:val="24"/>
@@ -1514,7 +1447,6 @@
                                     </w:rPr>
                                     <w:t>.jsx</w:t>
                                   </w:r>
-                                  <w:proofErr w:type="spellEnd"/>
                                   <w:r>
                                     <w:rPr>
                                       <w:sz w:val="24"/>
@@ -1764,18 +1696,8 @@
                                       <w:szCs w:val="24"/>
                                       <w:lang w:val="en-US"/>
                                     </w:rPr>
-                                    <w:t xml:space="preserve">Template &gt; Create &gt; </w:t>
-                                  </w:r>
-                                  <w:proofErr w:type="spellStart"/>
-                                  <w:r>
-                                    <w:rPr>
-                                      <w:sz w:val="24"/>
-                                      <w:szCs w:val="24"/>
-                                      <w:lang w:val="en-US"/>
-                                    </w:rPr>
-                                    <w:t>index.jsx</w:t>
-                                  </w:r>
-                                  <w:proofErr w:type="spellEnd"/>
+                                    <w:t>Template &gt; Create &gt; index.jsx</w:t>
+                                  </w:r>
                                 </w:p>
                               </w:tc>
                               <w:tc>
@@ -1891,18 +1813,8 @@
                                       <w:szCs w:val="24"/>
                                       <w:lang w:val="en-US"/>
                                     </w:rPr>
-                                    <w:t xml:space="preserve">Template &gt; Create &gt; </w:t>
-                                  </w:r>
-                                  <w:proofErr w:type="spellStart"/>
-                                  <w:r>
-                                    <w:rPr>
-                                      <w:sz w:val="24"/>
-                                      <w:szCs w:val="24"/>
-                                      <w:lang w:val="en-US"/>
-                                    </w:rPr>
-                                    <w:t>index.jsx</w:t>
-                                  </w:r>
-                                  <w:proofErr w:type="spellEnd"/>
+                                    <w:t>Template &gt; Create &gt; index.jsx</w:t>
+                                  </w:r>
                                 </w:p>
                               </w:tc>
                               <w:tc>
@@ -1974,18 +1886,8 @@
                                       <w:szCs w:val="24"/>
                                       <w:lang w:val="en-US"/>
                                     </w:rPr>
-                                    <w:t>/</w:t>
-                                  </w:r>
-                                  <w:proofErr w:type="spellStart"/>
-                                  <w:r>
-                                    <w:rPr>
-                                      <w:sz w:val="24"/>
-                                      <w:szCs w:val="24"/>
-                                      <w:lang w:val="en-US"/>
-                                    </w:rPr>
-                                    <w:t>getAll</w:t>
-                                  </w:r>
-                                  <w:proofErr w:type="spellEnd"/>
+                                    <w:t>/getAll</w:t>
+                                  </w:r>
                                 </w:p>
                               </w:tc>
                               <w:tc>
@@ -2044,18 +1946,8 @@
                                       <w:szCs w:val="24"/>
                                       <w:lang w:val="en-US"/>
                                     </w:rPr>
-                                    <w:t xml:space="preserve">Template &gt; </w:t>
-                                  </w:r>
-                                  <w:proofErr w:type="spellStart"/>
-                                  <w:r>
-                                    <w:rPr>
-                                      <w:sz w:val="24"/>
-                                      <w:szCs w:val="24"/>
-                                      <w:lang w:val="en-US"/>
-                                    </w:rPr>
-                                    <w:t>index.jsx</w:t>
-                                  </w:r>
-                                  <w:proofErr w:type="spellEnd"/>
+                                    <w:t>Template &gt; index.jsx</w:t>
+                                  </w:r>
                                 </w:p>
                               </w:tc>
                               <w:tc>
@@ -2173,33 +2065,13 @@
                                       <w:lang w:val="en-US"/>
                                     </w:rPr>
                                   </w:pPr>
-                                  <w:proofErr w:type="spellStart"/>
-                                  <w:proofErr w:type="gramStart"/>
-                                  <w:r>
-                                    <w:rPr>
-                                      <w:sz w:val="24"/>
-                                      <w:szCs w:val="24"/>
-                                      <w:lang w:val="en-US"/>
-                                    </w:rPr>
-                                    <w:t>ViewTemplate.jsx</w:t>
-                                  </w:r>
-                                  <w:proofErr w:type="spellEnd"/>
-                                  <w:r>
-                                    <w:rPr>
-                                      <w:sz w:val="24"/>
-                                      <w:szCs w:val="24"/>
-                                      <w:lang w:val="en-US"/>
-                                    </w:rPr>
-                                    <w:t>(</w:t>
-                                  </w:r>
-                                  <w:proofErr w:type="gramEnd"/>
-                                  <w:r>
-                                    <w:rPr>
-                                      <w:sz w:val="24"/>
-                                      <w:szCs w:val="24"/>
-                                      <w:lang w:val="en-US"/>
-                                    </w:rPr>
-                                    <w:t>Components)</w:t>
+                                  <w:r>
+                                    <w:rPr>
+                                      <w:sz w:val="24"/>
+                                      <w:szCs w:val="24"/>
+                                      <w:lang w:val="en-US"/>
+                                    </w:rPr>
+                                    <w:t>ViewTemplate.jsx(Components)</w:t>
                                   </w:r>
                                 </w:p>
                               </w:tc>
@@ -2308,18 +2180,8 @@
                                       <w:szCs w:val="24"/>
                                       <w:lang w:val="en-US"/>
                                     </w:rPr>
-                                    <w:t xml:space="preserve">Template &gt; </w:t>
-                                  </w:r>
-                                  <w:proofErr w:type="spellStart"/>
-                                  <w:r>
-                                    <w:rPr>
-                                      <w:sz w:val="24"/>
-                                      <w:szCs w:val="24"/>
-                                      <w:lang w:val="en-US"/>
-                                    </w:rPr>
-                                    <w:t>index.jsx</w:t>
-                                  </w:r>
-                                  <w:proofErr w:type="spellEnd"/>
+                                    <w:t>Template &gt; index.jsx</w:t>
+                                  </w:r>
                                 </w:p>
                               </w:tc>
                               <w:tc>
@@ -2501,18 +2363,8 @@
                                       <w:szCs w:val="24"/>
                                       <w:lang w:val="en-US"/>
                                     </w:rPr>
-                                    <w:t>assessment /</w:t>
-                                  </w:r>
-                                  <w:proofErr w:type="spellStart"/>
-                                  <w:r>
-                                    <w:rPr>
-                                      <w:sz w:val="24"/>
-                                      <w:szCs w:val="24"/>
-                                      <w:lang w:val="en-US"/>
-                                    </w:rPr>
-                                    <w:t>createAi</w:t>
-                                  </w:r>
-                                  <w:proofErr w:type="spellEnd"/>
+                                    <w:t>assessment /createAi</w:t>
+                                  </w:r>
                                 </w:p>
                               </w:tc>
                               <w:tc>
@@ -2697,18 +2549,8 @@
                                       <w:szCs w:val="24"/>
                                       <w:lang w:val="en-US"/>
                                     </w:rPr>
-                                    <w:t>assessment/</w:t>
-                                  </w:r>
-                                  <w:proofErr w:type="spellStart"/>
-                                  <w:r>
-                                    <w:rPr>
-                                      <w:sz w:val="24"/>
-                                      <w:szCs w:val="24"/>
-                                      <w:lang w:val="en-US"/>
-                                    </w:rPr>
-                                    <w:t>getAll</w:t>
-                                  </w:r>
-                                  <w:proofErr w:type="spellEnd"/>
+                                    <w:t>assessment/getAll</w:t>
+                                  </w:r>
                                 </w:p>
                               </w:tc>
                               <w:tc>
@@ -2751,18 +2593,8 @@
                                       <w:szCs w:val="24"/>
                                       <w:lang w:val="en-US"/>
                                     </w:rPr>
-                                    <w:t xml:space="preserve">Assessment &gt; </w:t>
-                                  </w:r>
-                                  <w:proofErr w:type="spellStart"/>
-                                  <w:r>
-                                    <w:rPr>
-                                      <w:sz w:val="24"/>
-                                      <w:szCs w:val="24"/>
-                                      <w:lang w:val="en-US"/>
-                                    </w:rPr>
-                                    <w:t>index.jsx</w:t>
-                                  </w:r>
-                                  <w:proofErr w:type="spellEnd"/>
+                                    <w:t>Assessment &gt; index.jsx</w:t>
+                                  </w:r>
                                 </w:p>
                               </w:tc>
                               <w:tc>
@@ -2963,18 +2795,8 @@
                                       <w:szCs w:val="24"/>
                                       <w:lang w:val="en-US"/>
                                     </w:rPr>
-                                    <w:t xml:space="preserve">Assessment &gt; </w:t>
-                                  </w:r>
-                                  <w:proofErr w:type="spellStart"/>
-                                  <w:r>
-                                    <w:rPr>
-                                      <w:sz w:val="24"/>
-                                      <w:szCs w:val="24"/>
-                                      <w:lang w:val="en-US"/>
-                                    </w:rPr>
-                                    <w:t>index.jsx</w:t>
-                                  </w:r>
-                                  <w:proofErr w:type="spellEnd"/>
+                                    <w:t>Assessment &gt; index.jsx</w:t>
+                                  </w:r>
                                 </w:p>
                               </w:tc>
                               <w:tc>
@@ -3118,18 +2940,8 @@
                                       <w:szCs w:val="24"/>
                                       <w:lang w:val="en-US"/>
                                     </w:rPr>
-                                    <w:t>/</w:t>
-                                  </w:r>
-                                  <w:proofErr w:type="spellStart"/>
-                                  <w:r>
-                                    <w:rPr>
-                                      <w:sz w:val="24"/>
-                                      <w:szCs w:val="24"/>
-                                      <w:lang w:val="en-US"/>
-                                    </w:rPr>
-                                    <w:t>getAll</w:t>
-                                  </w:r>
-                                  <w:proofErr w:type="spellEnd"/>
+                                    <w:t>/getAll</w:t>
+                                  </w:r>
                                 </w:p>
                               </w:tc>
                               <w:tc>
@@ -3958,7 +3770,6 @@
                                 <w:lang w:val="en-US"/>
                               </w:rPr>
                             </w:pPr>
-                            <w:proofErr w:type="spellStart"/>
                             <w:r>
                               <w:rPr>
                                 <w:sz w:val="24"/>
@@ -3975,7 +3786,6 @@
                               </w:rPr>
                               <w:t>.jsx</w:t>
                             </w:r>
-                            <w:proofErr w:type="spellEnd"/>
                           </w:p>
                         </w:tc>
                         <w:tc>
@@ -4047,18 +3857,8 @@
                                 <w:szCs w:val="24"/>
                                 <w:lang w:val="en-US"/>
                               </w:rPr>
-                              <w:t>/</w:t>
-                            </w:r>
-                            <w:proofErr w:type="spellStart"/>
-                            <w:r>
-                              <w:rPr>
-                                <w:sz w:val="24"/>
-                                <w:szCs w:val="24"/>
-                                <w:lang w:val="en-US"/>
-                              </w:rPr>
-                              <w:t>editProfile</w:t>
-                            </w:r>
-                            <w:proofErr w:type="spellEnd"/>
+                              <w:t>/editProfile</w:t>
+                            </w:r>
                           </w:p>
                         </w:tc>
                         <w:tc>
@@ -4158,18 +3958,8 @@
                                 <w:szCs w:val="24"/>
                                 <w:lang w:val="en-US"/>
                               </w:rPr>
-                              <w:t>/</w:t>
-                            </w:r>
-                            <w:proofErr w:type="spellStart"/>
-                            <w:r>
-                              <w:rPr>
-                                <w:sz w:val="24"/>
-                                <w:szCs w:val="24"/>
-                                <w:lang w:val="en-US"/>
-                              </w:rPr>
-                              <w:t>confirmAccess</w:t>
-                            </w:r>
-                            <w:proofErr w:type="spellEnd"/>
+                              <w:t>/confirmAccess</w:t>
+                            </w:r>
                           </w:p>
                         </w:tc>
                         <w:tc>
@@ -4285,18 +4075,8 @@
                                 <w:szCs w:val="24"/>
                                 <w:lang w:val="en-US"/>
                               </w:rPr>
-                              <w:t>/</w:t>
-                            </w:r>
-                            <w:proofErr w:type="spellStart"/>
-                            <w:r>
-                              <w:rPr>
-                                <w:sz w:val="24"/>
-                                <w:szCs w:val="24"/>
-                                <w:lang w:val="en-US"/>
-                              </w:rPr>
-                              <w:t>resetPassword</w:t>
-                            </w:r>
-                            <w:proofErr w:type="spellEnd"/>
+                              <w:t>/resetPassword</w:t>
+                            </w:r>
                           </w:p>
                         </w:tc>
                         <w:tc>
@@ -4434,7 +4214,6 @@
                                 <w:lang w:val="en-US"/>
                               </w:rPr>
                             </w:pPr>
-                            <w:proofErr w:type="spellStart"/>
                             <w:r>
                               <w:rPr>
                                 <w:sz w:val="24"/>
@@ -4451,7 +4230,6 @@
                               </w:rPr>
                               <w:t>.jsx</w:t>
                             </w:r>
-                            <w:proofErr w:type="spellEnd"/>
                           </w:p>
                         </w:tc>
                         <w:tc>
@@ -4687,7 +4465,6 @@
                                 <w:lang w:val="en-US"/>
                               </w:rPr>
                             </w:pPr>
-                            <w:proofErr w:type="spellStart"/>
                             <w:r>
                               <w:rPr>
                                 <w:sz w:val="24"/>
@@ -4704,7 +4481,6 @@
                               </w:rPr>
                               <w:t>.jsx</w:t>
                             </w:r>
-                            <w:proofErr w:type="spellEnd"/>
                           </w:p>
                         </w:tc>
                         <w:tc>
@@ -4776,18 +4552,8 @@
                                 <w:szCs w:val="24"/>
                                 <w:lang w:val="en-US"/>
                               </w:rPr>
-                              <w:t>/</w:t>
-                            </w:r>
-                            <w:proofErr w:type="spellStart"/>
-                            <w:r>
-                              <w:rPr>
-                                <w:sz w:val="24"/>
-                                <w:szCs w:val="24"/>
-                                <w:lang w:val="en-US"/>
-                              </w:rPr>
-                              <w:t>editProfile</w:t>
-                            </w:r>
-                            <w:proofErr w:type="spellEnd"/>
+                              <w:t>/editProfile</w:t>
+                            </w:r>
                           </w:p>
                         </w:tc>
                         <w:tc>
@@ -4887,18 +4653,8 @@
                                 <w:szCs w:val="24"/>
                                 <w:lang w:val="en-US"/>
                               </w:rPr>
-                              <w:t>/</w:t>
-                            </w:r>
-                            <w:proofErr w:type="spellStart"/>
-                            <w:r>
-                              <w:rPr>
-                                <w:sz w:val="24"/>
-                                <w:szCs w:val="24"/>
-                                <w:lang w:val="en-US"/>
-                              </w:rPr>
-                              <w:t>confirmAccess</w:t>
-                            </w:r>
-                            <w:proofErr w:type="spellEnd"/>
+                              <w:t>/confirmAccess</w:t>
+                            </w:r>
                           </w:p>
                         </w:tc>
                         <w:tc>
@@ -5022,18 +4778,8 @@
                                 <w:szCs w:val="24"/>
                                 <w:lang w:val="en-US"/>
                               </w:rPr>
-                              <w:t>/</w:t>
-                            </w:r>
-                            <w:proofErr w:type="spellStart"/>
-                            <w:r>
-                              <w:rPr>
-                                <w:sz w:val="24"/>
-                                <w:szCs w:val="24"/>
-                                <w:lang w:val="en-US"/>
-                              </w:rPr>
-                              <w:t>resetPassword</w:t>
-                            </w:r>
-                            <w:proofErr w:type="spellEnd"/>
+                              <w:t>/resetPassword</w:t>
+                            </w:r>
                           </w:p>
                         </w:tc>
                         <w:tc>
@@ -5171,7 +4917,6 @@
                                 <w:lang w:val="en-US"/>
                               </w:rPr>
                             </w:pPr>
-                            <w:proofErr w:type="spellStart"/>
                             <w:r>
                               <w:rPr>
                                 <w:sz w:val="24"/>
@@ -5188,7 +4933,6 @@
                               </w:rPr>
                               <w:t>.jsx</w:t>
                             </w:r>
-                            <w:proofErr w:type="spellEnd"/>
                             <w:r>
                               <w:rPr>
                                 <w:sz w:val="24"/>
@@ -5438,18 +5182,8 @@
                                 <w:szCs w:val="24"/>
                                 <w:lang w:val="en-US"/>
                               </w:rPr>
-                              <w:t xml:space="preserve">Template &gt; Create &gt; </w:t>
-                            </w:r>
-                            <w:proofErr w:type="spellStart"/>
-                            <w:r>
-                              <w:rPr>
-                                <w:sz w:val="24"/>
-                                <w:szCs w:val="24"/>
-                                <w:lang w:val="en-US"/>
-                              </w:rPr>
-                              <w:t>index.jsx</w:t>
-                            </w:r>
-                            <w:proofErr w:type="spellEnd"/>
+                              <w:t>Template &gt; Create &gt; index.jsx</w:t>
+                            </w:r>
                           </w:p>
                         </w:tc>
                         <w:tc>
@@ -5565,18 +5299,8 @@
                                 <w:szCs w:val="24"/>
                                 <w:lang w:val="en-US"/>
                               </w:rPr>
-                              <w:t xml:space="preserve">Template &gt; Create &gt; </w:t>
-                            </w:r>
-                            <w:proofErr w:type="spellStart"/>
-                            <w:r>
-                              <w:rPr>
-                                <w:sz w:val="24"/>
-                                <w:szCs w:val="24"/>
-                                <w:lang w:val="en-US"/>
-                              </w:rPr>
-                              <w:t>index.jsx</w:t>
-                            </w:r>
-                            <w:proofErr w:type="spellEnd"/>
+                              <w:t>Template &gt; Create &gt; index.jsx</w:t>
+                            </w:r>
                           </w:p>
                         </w:tc>
                         <w:tc>
@@ -5648,18 +5372,8 @@
                                 <w:szCs w:val="24"/>
                                 <w:lang w:val="en-US"/>
                               </w:rPr>
-                              <w:t>/</w:t>
-                            </w:r>
-                            <w:proofErr w:type="spellStart"/>
-                            <w:r>
-                              <w:rPr>
-                                <w:sz w:val="24"/>
-                                <w:szCs w:val="24"/>
-                                <w:lang w:val="en-US"/>
-                              </w:rPr>
-                              <w:t>getAll</w:t>
-                            </w:r>
-                            <w:proofErr w:type="spellEnd"/>
+                              <w:t>/getAll</w:t>
+                            </w:r>
                           </w:p>
                         </w:tc>
                         <w:tc>
@@ -5718,18 +5432,8 @@
                                 <w:szCs w:val="24"/>
                                 <w:lang w:val="en-US"/>
                               </w:rPr>
-                              <w:t xml:space="preserve">Template &gt; </w:t>
-                            </w:r>
-                            <w:proofErr w:type="spellStart"/>
-                            <w:r>
-                              <w:rPr>
-                                <w:sz w:val="24"/>
-                                <w:szCs w:val="24"/>
-                                <w:lang w:val="en-US"/>
-                              </w:rPr>
-                              <w:t>index.jsx</w:t>
-                            </w:r>
-                            <w:proofErr w:type="spellEnd"/>
+                              <w:t>Template &gt; index.jsx</w:t>
+                            </w:r>
                           </w:p>
                         </w:tc>
                         <w:tc>
@@ -5847,33 +5551,13 @@
                                 <w:lang w:val="en-US"/>
                               </w:rPr>
                             </w:pPr>
-                            <w:proofErr w:type="spellStart"/>
-                            <w:proofErr w:type="gramStart"/>
-                            <w:r>
-                              <w:rPr>
-                                <w:sz w:val="24"/>
-                                <w:szCs w:val="24"/>
-                                <w:lang w:val="en-US"/>
-                              </w:rPr>
-                              <w:t>ViewTemplate.jsx</w:t>
-                            </w:r>
-                            <w:proofErr w:type="spellEnd"/>
-                            <w:r>
-                              <w:rPr>
-                                <w:sz w:val="24"/>
-                                <w:szCs w:val="24"/>
-                                <w:lang w:val="en-US"/>
-                              </w:rPr>
-                              <w:t>(</w:t>
-                            </w:r>
-                            <w:proofErr w:type="gramEnd"/>
-                            <w:r>
-                              <w:rPr>
-                                <w:sz w:val="24"/>
-                                <w:szCs w:val="24"/>
-                                <w:lang w:val="en-US"/>
-                              </w:rPr>
-                              <w:t>Components)</w:t>
+                            <w:r>
+                              <w:rPr>
+                                <w:sz w:val="24"/>
+                                <w:szCs w:val="24"/>
+                                <w:lang w:val="en-US"/>
+                              </w:rPr>
+                              <w:t>ViewTemplate.jsx(Components)</w:t>
                             </w:r>
                           </w:p>
                         </w:tc>
@@ -5982,18 +5666,8 @@
                                 <w:szCs w:val="24"/>
                                 <w:lang w:val="en-US"/>
                               </w:rPr>
-                              <w:t xml:space="preserve">Template &gt; </w:t>
-                            </w:r>
-                            <w:proofErr w:type="spellStart"/>
-                            <w:r>
-                              <w:rPr>
-                                <w:sz w:val="24"/>
-                                <w:szCs w:val="24"/>
-                                <w:lang w:val="en-US"/>
-                              </w:rPr>
-                              <w:t>index.jsx</w:t>
-                            </w:r>
-                            <w:proofErr w:type="spellEnd"/>
+                              <w:t>Template &gt; index.jsx</w:t>
+                            </w:r>
                           </w:p>
                         </w:tc>
                         <w:tc>
@@ -6175,18 +5849,8 @@
                                 <w:szCs w:val="24"/>
                                 <w:lang w:val="en-US"/>
                               </w:rPr>
-                              <w:t>assessment /</w:t>
-                            </w:r>
-                            <w:proofErr w:type="spellStart"/>
-                            <w:r>
-                              <w:rPr>
-                                <w:sz w:val="24"/>
-                                <w:szCs w:val="24"/>
-                                <w:lang w:val="en-US"/>
-                              </w:rPr>
-                              <w:t>createAi</w:t>
-                            </w:r>
-                            <w:proofErr w:type="spellEnd"/>
+                              <w:t>assessment /createAi</w:t>
+                            </w:r>
                           </w:p>
                         </w:tc>
                         <w:tc>
@@ -6371,18 +6035,8 @@
                                 <w:szCs w:val="24"/>
                                 <w:lang w:val="en-US"/>
                               </w:rPr>
-                              <w:t>assessment/</w:t>
-                            </w:r>
-                            <w:proofErr w:type="spellStart"/>
-                            <w:r>
-                              <w:rPr>
-                                <w:sz w:val="24"/>
-                                <w:szCs w:val="24"/>
-                                <w:lang w:val="en-US"/>
-                              </w:rPr>
-                              <w:t>getAll</w:t>
-                            </w:r>
-                            <w:proofErr w:type="spellEnd"/>
+                              <w:t>assessment/getAll</w:t>
+                            </w:r>
                           </w:p>
                         </w:tc>
                         <w:tc>
@@ -6425,18 +6079,8 @@
                                 <w:szCs w:val="24"/>
                                 <w:lang w:val="en-US"/>
                               </w:rPr>
-                              <w:t xml:space="preserve">Assessment &gt; </w:t>
-                            </w:r>
-                            <w:proofErr w:type="spellStart"/>
-                            <w:r>
-                              <w:rPr>
-                                <w:sz w:val="24"/>
-                                <w:szCs w:val="24"/>
-                                <w:lang w:val="en-US"/>
-                              </w:rPr>
-                              <w:t>index.jsx</w:t>
-                            </w:r>
-                            <w:proofErr w:type="spellEnd"/>
+                              <w:t>Assessment &gt; index.jsx</w:t>
+                            </w:r>
                           </w:p>
                         </w:tc>
                         <w:tc>
@@ -6637,18 +6281,8 @@
                                 <w:szCs w:val="24"/>
                                 <w:lang w:val="en-US"/>
                               </w:rPr>
-                              <w:t xml:space="preserve">Assessment &gt; </w:t>
-                            </w:r>
-                            <w:proofErr w:type="spellStart"/>
-                            <w:r>
-                              <w:rPr>
-                                <w:sz w:val="24"/>
-                                <w:szCs w:val="24"/>
-                                <w:lang w:val="en-US"/>
-                              </w:rPr>
-                              <w:t>index.jsx</w:t>
-                            </w:r>
-                            <w:proofErr w:type="spellEnd"/>
+                              <w:t>Assessment &gt; index.jsx</w:t>
+                            </w:r>
                           </w:p>
                         </w:tc>
                         <w:tc>
@@ -6792,18 +6426,8 @@
                                 <w:szCs w:val="24"/>
                                 <w:lang w:val="en-US"/>
                               </w:rPr>
-                              <w:t>/</w:t>
-                            </w:r>
-                            <w:proofErr w:type="spellStart"/>
-                            <w:r>
-                              <w:rPr>
-                                <w:sz w:val="24"/>
-                                <w:szCs w:val="24"/>
-                                <w:lang w:val="en-US"/>
-                              </w:rPr>
-                              <w:t>getAll</w:t>
-                            </w:r>
-                            <w:proofErr w:type="spellEnd"/>
+                              <w:t>/getAll</w:t>
+                            </w:r>
                           </w:p>
                         </w:tc>
                         <w:tc>
@@ -7379,6 +7003,450 @@
           </mc:Fallback>
         </mc:AlternateContent>
       </w:r>
+    </w:p>
+    <w:p>
+      <w:pPr>
+        <w:rPr>
+          <w:sz w:val="36"/>
+          <w:szCs w:val="36"/>
+          <w:lang w:val="en-US"/>
+        </w:rPr>
+      </w:pPr>
+      <w:r>
+        <w:rPr>
+          <w:sz w:val="36"/>
+          <w:szCs w:val="36"/>
+          <w:lang w:val="en-US"/>
+        </w:rPr>
+        <w:br/>
+      </w:r>
+      <w:r>
+        <w:rPr>
+          <w:sz w:val="36"/>
+          <w:szCs w:val="36"/>
+          <w:lang w:val="en-US"/>
+        </w:rPr>
+        <w:br/>
+      </w:r>
+    </w:p>
+    <w:p>
+      <w:pPr>
+        <w:rPr>
+          <w:sz w:val="36"/>
+          <w:szCs w:val="36"/>
+          <w:lang w:val="en-US"/>
+        </w:rPr>
+      </w:pPr>
+    </w:p>
+    <w:tbl>
+      <w:tblPr>
+        <w:tblStyle w:val="TableGrid"/>
+        <w:tblW w:w="0" w:type="auto"/>
+        <w:tblLook w:val="04A0" w:firstRow="1" w:lastRow="0" w:firstColumn="1" w:lastColumn="0" w:noHBand="0" w:noVBand="1"/>
+      </w:tblPr>
+      <w:tblGrid>
+        <w:gridCol w:w="1413"/>
+        <w:gridCol w:w="7918"/>
+        <w:gridCol w:w="1125"/>
+      </w:tblGrid>
+      <w:tr>
+        <w:tc>
+          <w:tcPr>
+            <w:tcW w:w="1413" w:type="dxa"/>
+          </w:tcPr>
+          <w:p>
+            <w:pPr>
+              <w:rPr>
+                <w:sz w:val="36"/>
+                <w:szCs w:val="36"/>
+                <w:lang w:val="en-US"/>
+              </w:rPr>
+            </w:pPr>
+            <w:r>
+              <w:rPr>
+                <w:sz w:val="36"/>
+                <w:szCs w:val="36"/>
+                <w:lang w:val="en-US"/>
+              </w:rPr>
+              <w:lastRenderedPageBreak/>
+              <w:t>Date</w:t>
+            </w:r>
+          </w:p>
+        </w:tc>
+        <w:tc>
+          <w:tcPr>
+            <w:tcW w:w="7938" w:type="dxa"/>
+          </w:tcPr>
+          <w:p>
+            <w:pPr>
+              <w:rPr>
+                <w:sz w:val="36"/>
+                <w:szCs w:val="36"/>
+                <w:lang w:val="en-US"/>
+              </w:rPr>
+            </w:pPr>
+            <w:r>
+              <w:rPr>
+                <w:sz w:val="36"/>
+                <w:szCs w:val="36"/>
+                <w:lang w:val="en-US"/>
+              </w:rPr>
+              <w:t>Error</w:t>
+            </w:r>
+          </w:p>
+        </w:tc>
+        <w:tc>
+          <w:tcPr>
+            <w:tcW w:w="1105" w:type="dxa"/>
+          </w:tcPr>
+          <w:p>
+            <w:pPr>
+              <w:rPr>
+                <w:sz w:val="36"/>
+                <w:szCs w:val="36"/>
+                <w:lang w:val="en-US"/>
+              </w:rPr>
+            </w:pPr>
+            <w:r>
+              <w:rPr>
+                <w:sz w:val="36"/>
+                <w:szCs w:val="36"/>
+                <w:lang w:val="en-US"/>
+              </w:rPr>
+              <w:t>Status</w:t>
+            </w:r>
+          </w:p>
+        </w:tc>
+      </w:tr>
+      <w:tr>
+        <w:tc>
+          <w:tcPr>
+            <w:tcW w:w="1413" w:type="dxa"/>
+          </w:tcPr>
+          <w:p>
+            <w:pPr>
+              <w:rPr>
+                <w:lang w:val="en-US"/>
+              </w:rPr>
+            </w:pPr>
+            <w:r>
+              <w:rPr>
+                <w:lang w:val="en-US"/>
+              </w:rPr>
+              <w:t>08/07/2</w:t>
+            </w:r>
+            <w:r>
+              <w:rPr>
+                <w:lang w:val="en-US"/>
+              </w:rPr>
+              <w:t>02</w:t>
+            </w:r>
+            <w:r>
+              <w:rPr>
+                <w:lang w:val="en-US"/>
+              </w:rPr>
+              <w:t>6</w:t>
+            </w:r>
+          </w:p>
+        </w:tc>
+        <w:tc>
+          <w:tcPr>
+            <w:tcW w:w="7938" w:type="dxa"/>
+          </w:tcPr>
+          <w:p>
+            <w:pPr>
+              <w:rPr>
+                <w:lang w:val="en-US"/>
+              </w:rPr>
+            </w:pPr>
+            <w:r>
+              <w:rPr>
+                <w:lang w:val="en-US"/>
+              </w:rPr>
+              <w:t xml:space="preserve">Template edit – if adding a question types </w:t>
+            </w:r>
+            <w:r>
+              <w:rPr>
+                <w:lang w:val="en-US"/>
+              </w:rPr>
+              <w:t>the previous question type values are getting empty</w:t>
+            </w:r>
+          </w:p>
+        </w:tc>
+        <w:tc>
+          <w:tcPr>
+            <w:tcW w:w="1105" w:type="dxa"/>
+          </w:tcPr>
+          <w:p>
+            <w:pPr>
+              <w:rPr>
+                <w:lang w:val="en-US"/>
+              </w:rPr>
+            </w:pPr>
+            <w:r>
+              <w:rPr>
+                <w:lang w:val="en-US"/>
+              </w:rPr>
+              <w:t>Done</w:t>
+            </w:r>
+          </w:p>
+        </w:tc>
+      </w:tr>
+      <w:tr>
+        <w:tc>
+          <w:tcPr>
+            <w:tcW w:w="1413" w:type="dxa"/>
+          </w:tcPr>
+          <w:p>
+            <w:pPr>
+              <w:rPr>
+                <w:lang w:val="en-US"/>
+              </w:rPr>
+            </w:pPr>
+          </w:p>
+        </w:tc>
+        <w:tc>
+          <w:tcPr>
+            <w:tcW w:w="7938" w:type="dxa"/>
+          </w:tcPr>
+          <w:p>
+            <w:pPr>
+              <w:rPr>
+                <w:lang w:val="en-US"/>
+              </w:rPr>
+            </w:pPr>
+          </w:p>
+        </w:tc>
+        <w:tc>
+          <w:tcPr>
+            <w:tcW w:w="1105" w:type="dxa"/>
+          </w:tcPr>
+          <w:p>
+            <w:pPr>
+              <w:rPr>
+                <w:lang w:val="en-US"/>
+              </w:rPr>
+            </w:pPr>
+          </w:p>
+        </w:tc>
+      </w:tr>
+      <w:tr>
+        <w:tc>
+          <w:tcPr>
+            <w:tcW w:w="1413" w:type="dxa"/>
+          </w:tcPr>
+          <w:p>
+            <w:pPr>
+              <w:rPr>
+                <w:lang w:val="en-US"/>
+              </w:rPr>
+            </w:pPr>
+          </w:p>
+        </w:tc>
+        <w:tc>
+          <w:tcPr>
+            <w:tcW w:w="7938" w:type="dxa"/>
+          </w:tcPr>
+          <w:p>
+            <w:pPr>
+              <w:rPr>
+                <w:lang w:val="en-US"/>
+              </w:rPr>
+            </w:pPr>
+          </w:p>
+        </w:tc>
+        <w:tc>
+          <w:tcPr>
+            <w:tcW w:w="1105" w:type="dxa"/>
+          </w:tcPr>
+          <w:p>
+            <w:pPr>
+              <w:rPr>
+                <w:lang w:val="en-US"/>
+              </w:rPr>
+            </w:pPr>
+          </w:p>
+        </w:tc>
+      </w:tr>
+      <w:tr>
+        <w:tc>
+          <w:tcPr>
+            <w:tcW w:w="1413" w:type="dxa"/>
+          </w:tcPr>
+          <w:p>
+            <w:pPr>
+              <w:rPr>
+                <w:lang w:val="en-US"/>
+              </w:rPr>
+            </w:pPr>
+          </w:p>
+        </w:tc>
+        <w:tc>
+          <w:tcPr>
+            <w:tcW w:w="7938" w:type="dxa"/>
+          </w:tcPr>
+          <w:p>
+            <w:pPr>
+              <w:rPr>
+                <w:lang w:val="en-US"/>
+              </w:rPr>
+            </w:pPr>
+          </w:p>
+        </w:tc>
+        <w:tc>
+          <w:tcPr>
+            <w:tcW w:w="1105" w:type="dxa"/>
+          </w:tcPr>
+          <w:p>
+            <w:pPr>
+              <w:rPr>
+                <w:lang w:val="en-US"/>
+              </w:rPr>
+            </w:pPr>
+          </w:p>
+        </w:tc>
+      </w:tr>
+      <w:tr>
+        <w:tc>
+          <w:tcPr>
+            <w:tcW w:w="1413" w:type="dxa"/>
+          </w:tcPr>
+          <w:p>
+            <w:pPr>
+              <w:rPr>
+                <w:lang w:val="en-US"/>
+              </w:rPr>
+            </w:pPr>
+          </w:p>
+        </w:tc>
+        <w:tc>
+          <w:tcPr>
+            <w:tcW w:w="7938" w:type="dxa"/>
+          </w:tcPr>
+          <w:p>
+            <w:pPr>
+              <w:rPr>
+                <w:lang w:val="en-US"/>
+              </w:rPr>
+            </w:pPr>
+          </w:p>
+        </w:tc>
+        <w:tc>
+          <w:tcPr>
+            <w:tcW w:w="1105" w:type="dxa"/>
+          </w:tcPr>
+          <w:p>
+            <w:pPr>
+              <w:rPr>
+                <w:lang w:val="en-US"/>
+              </w:rPr>
+            </w:pPr>
+          </w:p>
+        </w:tc>
+      </w:tr>
+      <w:tr>
+        <w:tc>
+          <w:tcPr>
+            <w:tcW w:w="1413" w:type="dxa"/>
+          </w:tcPr>
+          <w:p>
+            <w:pPr>
+              <w:rPr>
+                <w:lang w:val="en-US"/>
+              </w:rPr>
+            </w:pPr>
+          </w:p>
+        </w:tc>
+        <w:tc>
+          <w:tcPr>
+            <w:tcW w:w="7938" w:type="dxa"/>
+          </w:tcPr>
+          <w:p>
+            <w:pPr>
+              <w:rPr>
+                <w:lang w:val="en-US"/>
+              </w:rPr>
+            </w:pPr>
+          </w:p>
+        </w:tc>
+        <w:tc>
+          <w:tcPr>
+            <w:tcW w:w="1105" w:type="dxa"/>
+          </w:tcPr>
+          <w:p>
+            <w:pPr>
+              <w:rPr>
+                <w:lang w:val="en-US"/>
+              </w:rPr>
+            </w:pPr>
+          </w:p>
+        </w:tc>
+      </w:tr>
+      <w:tr>
+        <w:tc>
+          <w:tcPr>
+            <w:tcW w:w="1413" w:type="dxa"/>
+          </w:tcPr>
+          <w:p>
+            <w:pPr>
+              <w:rPr>
+                <w:lang w:val="en-US"/>
+              </w:rPr>
+            </w:pPr>
+          </w:p>
+        </w:tc>
+        <w:tc>
+          <w:tcPr>
+            <w:tcW w:w="7938" w:type="dxa"/>
+          </w:tcPr>
+          <w:p>
+            <w:pPr>
+              <w:rPr>
+                <w:lang w:val="en-US"/>
+              </w:rPr>
+            </w:pPr>
+          </w:p>
+        </w:tc>
+        <w:tc>
+          <w:tcPr>
+            <w:tcW w:w="1105" w:type="dxa"/>
+          </w:tcPr>
+          <w:p>
+            <w:pPr>
+              <w:rPr>
+                <w:lang w:val="en-US"/>
+              </w:rPr>
+            </w:pPr>
+          </w:p>
+        </w:tc>
+      </w:tr>
+    </w:tbl>
+    <w:p>
+      <w:pPr>
+        <w:rPr>
+          <w:sz w:val="36"/>
+          <w:szCs w:val="36"/>
+          <w:lang w:val="en-US"/>
+        </w:rPr>
+      </w:pPr>
+    </w:p>
+    <w:p>
+      <w:pPr>
+        <w:rPr>
+          <w:sz w:val="36"/>
+          <w:szCs w:val="36"/>
+          <w:lang w:val="en-US"/>
+        </w:rPr>
+      </w:pPr>
+    </w:p>
+    <w:p>
+      <w:pPr>
+        <w:rPr>
+          <w:sz w:val="36"/>
+          <w:szCs w:val="36"/>
+          <w:lang w:val="en-US"/>
+        </w:rPr>
+      </w:pPr>
     </w:p>
     <w:sectPr>
       <w:pgSz w:w="11906" w:h="16838"/>

</xml_diff>

<commit_message>
Changes the teacher - student MCRS
</commit_message>
<xml_diff>
--- a/Qgenie Docs.docx
+++ b/Qgenie Docs.docx
@@ -2238,13 +2238,7 @@
                                     <w:rPr>
                                       <w:lang w:val="en-US"/>
                                     </w:rPr>
-                                    <w:t>/teacher/</w:t>
-                                  </w:r>
-                                  <w:r>
-                                    <w:rPr>
-                                      <w:lang w:val="en-US"/>
-                                    </w:rPr>
-                                    <w:t>assessment /edit/:id</w:t>
+                                    <w:t>/teacher/assessment /edit/:id</w:t>
                                   </w:r>
                                 </w:p>
                               </w:tc>
@@ -2343,13 +2337,7 @@
                                     <w:rPr>
                                       <w:lang w:val="en-US"/>
                                     </w:rPr>
-                                    <w:t>/teacher/</w:t>
-                                  </w:r>
-                                  <w:r>
-                                    <w:rPr>
-                                      <w:lang w:val="en-US"/>
-                                    </w:rPr>
-                                    <w:t>assessment/</w:t>
+                                    <w:t>/teacher/assessment/</w:t>
                                   </w:r>
                                   <w:proofErr w:type="spellStart"/>
                                   <w:r>
@@ -2456,13 +2444,7 @@
                                     <w:rPr>
                                       <w:lang w:val="en-US"/>
                                     </w:rPr>
-                                    <w:t>/teacher/</w:t>
-                                  </w:r>
-                                  <w:r>
-                                    <w:rPr>
-                                      <w:lang w:val="en-US"/>
-                                    </w:rPr>
-                                    <w:t>assessment/get/:id</w:t>
+                                    <w:t>/teacher/assessment/get/:id</w:t>
                                   </w:r>
                                 </w:p>
                               </w:tc>
@@ -2569,13 +2551,7 @@
                                     <w:rPr>
                                       <w:lang w:val="en-US"/>
                                     </w:rPr>
-                                    <w:t>/teacher/</w:t>
-                                  </w:r>
-                                  <w:r>
-                                    <w:rPr>
-                                      <w:lang w:val="en-US"/>
-                                    </w:rPr>
-                                    <w:t>assessment/delete/:id</w:t>
+                                    <w:t>/teacher/assessment/delete/:id</w:t>
                                   </w:r>
                                 </w:p>
                               </w:tc>
@@ -5599,13 +5575,7 @@
                               <w:rPr>
                                 <w:lang w:val="en-US"/>
                               </w:rPr>
-                              <w:t>/teacher/</w:t>
-                            </w:r>
-                            <w:r>
-                              <w:rPr>
-                                <w:lang w:val="en-US"/>
-                              </w:rPr>
-                              <w:t>assessment /edit/:id</w:t>
+                              <w:t>/teacher/assessment /edit/:id</w:t>
                             </w:r>
                           </w:p>
                         </w:tc>
@@ -5704,13 +5674,7 @@
                               <w:rPr>
                                 <w:lang w:val="en-US"/>
                               </w:rPr>
-                              <w:t>/teacher/</w:t>
-                            </w:r>
-                            <w:r>
-                              <w:rPr>
-                                <w:lang w:val="en-US"/>
-                              </w:rPr>
-                              <w:t>assessment/</w:t>
+                              <w:t>/teacher/assessment/</w:t>
                             </w:r>
                             <w:proofErr w:type="spellStart"/>
                             <w:r>
@@ -5817,13 +5781,7 @@
                               <w:rPr>
                                 <w:lang w:val="en-US"/>
                               </w:rPr>
-                              <w:t>/teacher/</w:t>
-                            </w:r>
-                            <w:r>
-                              <w:rPr>
-                                <w:lang w:val="en-US"/>
-                              </w:rPr>
-                              <w:t>assessment/get/:id</w:t>
+                              <w:t>/teacher/assessment/get/:id</w:t>
                             </w:r>
                           </w:p>
                         </w:tc>
@@ -5930,13 +5888,7 @@
                               <w:rPr>
                                 <w:lang w:val="en-US"/>
                               </w:rPr>
-                              <w:t>/teacher/</w:t>
-                            </w:r>
-                            <w:r>
-                              <w:rPr>
-                                <w:lang w:val="en-US"/>
-                              </w:rPr>
-                              <w:t>assessment/delete/:id</w:t>
+                              <w:t>/teacher/assessment/delete/:id</w:t>
                             </w:r>
                           </w:p>
                         </w:tc>
@@ -6770,6 +6722,24 @@
         </w:rPr>
         <w:br/>
       </w:r>
+    </w:p>
+    <w:p>
+      <w:pPr>
+        <w:rPr>
+          <w:sz w:val="36"/>
+          <w:szCs w:val="36"/>
+          <w:lang w:val="en-US"/>
+        </w:rPr>
+      </w:pPr>
+    </w:p>
+    <w:p>
+      <w:pPr>
+        <w:rPr>
+          <w:sz w:val="36"/>
+          <w:szCs w:val="36"/>
+          <w:lang w:val="en-US"/>
+        </w:rPr>
+      </w:pPr>
       <w:r>
         <w:rPr>
           <w:sz w:val="36"/>
@@ -6795,7 +6765,26 @@
           <w:szCs w:val="36"/>
           <w:lang w:val="en-US"/>
         </w:rPr>
-        <w:t>ERROR LIST</w:t>
+        <w:lastRenderedPageBreak/>
+        <w:t>ERROR</w:t>
+      </w:r>
+      <w:r>
+        <w:rPr>
+          <w:color w:val="FF0000"/>
+          <w:sz w:val="36"/>
+          <w:szCs w:val="36"/>
+          <w:lang w:val="en-US"/>
+        </w:rPr>
+        <w:t xml:space="preserve"> &amp; TODO</w:t>
+      </w:r>
+      <w:r>
+        <w:rPr>
+          <w:color w:val="FF0000"/>
+          <w:sz w:val="36"/>
+          <w:szCs w:val="36"/>
+          <w:lang w:val="en-US"/>
+        </w:rPr>
+        <w:t xml:space="preserve"> LIST</w:t>
       </w:r>
     </w:p>
     <w:tbl>
@@ -6892,7 +6881,6 @@
               <w:rPr>
                 <w:lang w:val="en-US"/>
               </w:rPr>
-              <w:lastRenderedPageBreak/>
               <w:t>08/07/2</w:t>
             </w:r>
             <w:r>
@@ -6963,6 +6951,12 @@
                 <w:lang w:val="en-US"/>
               </w:rPr>
             </w:pPr>
+            <w:r>
+              <w:rPr>
+                <w:lang w:val="en-US"/>
+              </w:rPr>
+              <w:t>20/07/2026</w:t>
+            </w:r>
           </w:p>
         </w:tc>
         <w:tc>
@@ -6975,6 +6969,12 @@
                 <w:lang w:val="en-US"/>
               </w:rPr>
             </w:pPr>
+            <w:r>
+              <w:rPr>
+                <w:lang w:val="en-US"/>
+              </w:rPr>
+              <w:t>Generate id for students and teachers while signup</w:t>
+            </w:r>
           </w:p>
         </w:tc>
         <w:tc>

</xml_diff>